<commit_message>
adcionado consumo da procedure pelo api
</commit_message>
<xml_diff>
--- a/documentaçãoDB.docx
+++ b/documentaçãoDB.docx
@@ -3460,8 +3460,6 @@
         </w:rPr>
         <w:t>Exemplo das auditorias</w:t>
       </w:r>
-      <w:bookmarkStart w:id="4" w:name="_GoBack"/>
-      <w:bookmarkEnd w:id="4"/>
       <w:r>
         <w:rPr>
           <w:rFonts w:ascii="Times New Roman" w:hAnsi="Times New Roman" w:cs="Times New Roman"/>
@@ -3471,6 +3469,8 @@
       <w:r>
         <w:rPr>
           <w:rFonts w:ascii="Times New Roman" w:hAnsi="Times New Roman" w:cs="Times New Roman"/>
+          <w:noProof/>
+          <w:lang w:eastAsia="pt-BR"/>
         </w:rPr>
         <w:drawing>
           <wp:inline distT="0" distB="0" distL="0" distR="0" wp14:anchorId="69B051B3" wp14:editId="0ED3CBD6">
@@ -3547,6 +3547,105 @@
       </w:r>
     </w:p>
     <w:p/>
+    <w:p>
+      <w:r>
+        <w:lastRenderedPageBreak/>
+        <w:t xml:space="preserve">Procedure sendo chamada no </w:t>
+      </w:r>
+      <w:proofErr w:type="spellStart"/>
+      <w:r>
+        <w:t>backend</w:t>
+      </w:r>
+      <w:proofErr w:type="spellEnd"/>
+      <w:r>
+        <w:t xml:space="preserve"> – referente a criação de um PET</w:t>
+      </w:r>
+      <w:r>
+        <w:br/>
+      </w:r>
+      <w:r>
+        <w:rPr>
+          <w:noProof/>
+          <w:lang w:eastAsia="pt-BR"/>
+        </w:rPr>
+        <w:drawing>
+          <wp:inline distT="0" distB="0" distL="0" distR="0" wp14:anchorId="1EBF636F" wp14:editId="27B13CB6">
+            <wp:extent cx="5400040" cy="2909570"/>
+            <wp:effectExtent l="0" t="0" r="0" b="5080"/>
+            <wp:docPr id="3" name="Imagem 3"/>
+            <wp:cNvGraphicFramePr>
+              <a:graphicFrameLocks xmlns:a="http://schemas.openxmlformats.org/drawingml/2006/main" noChangeAspect="1"/>
+            </wp:cNvGraphicFramePr>
+            <a:graphic xmlns:a="http://schemas.openxmlformats.org/drawingml/2006/main">
+              <a:graphicData uri="http://schemas.openxmlformats.org/drawingml/2006/picture">
+                <pic:pic xmlns:pic="http://schemas.openxmlformats.org/drawingml/2006/picture">
+                  <pic:nvPicPr>
+                    <pic:cNvPr id="1" name=""/>
+                    <pic:cNvPicPr/>
+                  </pic:nvPicPr>
+                  <pic:blipFill>
+                    <a:blip r:embed="rId13"/>
+                    <a:stretch>
+                      <a:fillRect/>
+                    </a:stretch>
+                  </pic:blipFill>
+                  <pic:spPr>
+                    <a:xfrm>
+                      <a:off x="0" y="0"/>
+                      <a:ext cx="5400040" cy="2909570"/>
+                    </a:xfrm>
+                    <a:prstGeom prst="rect">
+                      <a:avLst/>
+                    </a:prstGeom>
+                  </pic:spPr>
+                </pic:pic>
+              </a:graphicData>
+            </a:graphic>
+          </wp:inline>
+        </w:drawing>
+      </w:r>
+      <w:bookmarkStart w:id="4" w:name="_GoBack"/>
+      <w:bookmarkEnd w:id="4"/>
+    </w:p>
+    <w:p>
+      <w:r>
+        <w:drawing>
+          <wp:inline distT="0" distB="0" distL="0" distR="0" wp14:anchorId="5561E9F2" wp14:editId="5E42BEBB">
+            <wp:extent cx="5400040" cy="2828925"/>
+            <wp:effectExtent l="0" t="0" r="0" b="9525"/>
+            <wp:docPr id="4" name="Imagem 4"/>
+            <wp:cNvGraphicFramePr>
+              <a:graphicFrameLocks xmlns:a="http://schemas.openxmlformats.org/drawingml/2006/main" noChangeAspect="1"/>
+            </wp:cNvGraphicFramePr>
+            <a:graphic xmlns:a="http://schemas.openxmlformats.org/drawingml/2006/main">
+              <a:graphicData uri="http://schemas.openxmlformats.org/drawingml/2006/picture">
+                <pic:pic xmlns:pic="http://schemas.openxmlformats.org/drawingml/2006/picture">
+                  <pic:nvPicPr>
+                    <pic:cNvPr id="1" name=""/>
+                    <pic:cNvPicPr/>
+                  </pic:nvPicPr>
+                  <pic:blipFill>
+                    <a:blip r:embed="rId14"/>
+                    <a:stretch>
+                      <a:fillRect/>
+                    </a:stretch>
+                  </pic:blipFill>
+                  <pic:spPr>
+                    <a:xfrm>
+                      <a:off x="0" y="0"/>
+                      <a:ext cx="5400040" cy="2828925"/>
+                    </a:xfrm>
+                    <a:prstGeom prst="rect">
+                      <a:avLst/>
+                    </a:prstGeom>
+                  </pic:spPr>
+                </pic:pic>
+              </a:graphicData>
+            </a:graphic>
+          </wp:inline>
+        </w:drawing>
+      </w:r>
+    </w:p>
     <w:p/>
     <w:sectPr>
       <w:pgSz w:w="11906" w:h="16838"/>
@@ -5329,7 +5428,7 @@
 </file>
 
 <file path=customXml/itemProps1.xml><?xml version="1.0" encoding="utf-8"?>
-<ds:datastoreItem xmlns:ds="http://schemas.openxmlformats.org/officeDocument/2006/customXml" ds:itemID="{FC670D5F-4455-41B2-ADDA-87BF7EC34E7B}">
+<ds:datastoreItem xmlns:ds="http://schemas.openxmlformats.org/officeDocument/2006/customXml" ds:itemID="{0435D1C4-555D-4B3B-9AE8-B69C21641603}">
   <ds:schemaRefs>
     <ds:schemaRef ds:uri="http://schemas.openxmlformats.org/officeDocument/2006/bibliography"/>
   </ds:schemaRefs>

</xml_diff>